<commit_message>
fix(cd2): update P3 target journal APJM → JABS throughout CĐ2 submission document
Seven occurrences replaced after IBR rejection and retarget to Journal of Asia
Business Studies (Emerald): version block, Vietnamese abstract, English abstract,
anchor evidence paragraph, §3.3 empirical evidence block, file-relations footer
note, and APA7 reference entry. Yang et al. (2025) APJM citation (separate paper)
unchanged. Docx regenerated.

https://claude.ai/code/session_01GMFmEtt6FYiJ4MKzBNCLqb
</commit_message>
<xml_diff>
--- a/chuyen_de/cd2/submission/cd2_submission_final.docx
+++ b/chuyen_de/cd2/submission/cd2_submission_final.docx
@@ -29,7 +29,7 @@
         <w:t xml:space="preserve">Phiên bản 2.1 (12/05/2026)</w:t>
       </w:r>
       <w:r>
-        <w:t xml:space="preserve">: Bản nộp chính thức — hợp nhất toàn bộ nội dung đã điều chỉnh theo kết quả thực nghiệm cuối cùng của P3 Việt Nam (APJM), P4 Singapore (MIR), P5 Trung Quốc (IJOEM). Pool 101.185 doanh nghiệp; 47 nền kinh tế (ICRV 6 nhóm: 5+5+6+7+17+7); 108 cặp quốc gia-năm; 14 sóng khảo sát WBES; 7 SIDS bao gồm Kiribati.</w:t>
+        <w:t xml:space="preserve">: Bản nộp chính thức — hợp nhất toàn bộ nội dung đã điều chỉnh theo kết quả thực nghiệm cuối cùng của P3 Việt Nam (JABS), P4 Singapore (MIR), P5 Trung Quốc (IJOEM). Pool 101.185 doanh nghiệp; 47 nền kinh tế (ICRV 6 nhóm: 5+5+6+7+17+7); 108 cặp quốc gia-năm; 14 sóng khảo sát WBES; 7 SIDS bao gồm Kiribati.</w:t>
       </w:r>
     </w:p>
     <w:p>
@@ -371,7 +371,7 @@
         <w:t xml:space="preserve"> </w:t>
       </w:r>
       <w:r>
-        <w:t xml:space="preserve">mốc khảo sát WBES 2009–2025. Đóng góp chính của chuyên đề: (i) khung tích hợp 4 tầng + Digital lens chưa có tương đương cho châu Á; (ii) tách bạch TCI và DAI theo mô hình CDCM (Context-Contingent Digital Capability Model) phát hiện trong CĐ1; (iii) mô hình M7 ba chiều moderation; (iv) sub-grouping Advanced regime thành tiên tiến đổi mới sáng tạo dẫn dắt (ICRV Nhóm I) và tiên tiến tài nguyên dẫn dắt (ICRV Nhóm II). Ba bản thảo thực nghiệm đồng hành — P3 Việt Nam (APJM, under review), P4 Singapore (MIR, under review), P5 Trung Quốc (IJOEM, under review) — cung cấp bằng chứng đất nước-cụ thể kiểm định H1–H6 và cấu trúc khả nghiệm CĐ2.</w:t>
+        <w:t xml:space="preserve">mốc khảo sát WBES 2009–2025. Đóng góp chính của chuyên đề: (i) khung tích hợp 4 tầng + Digital lens chưa có tương đương cho châu Á; (ii) tách bạch TCI và DAI theo mô hình CDCM (Context-Contingent Digital Capability Model) phát hiện trong CĐ1; (iii) mô hình M7 ba chiều moderation; (iv) sub-grouping Advanced regime thành tiên tiến đổi mới sáng tạo dẫn dắt (ICRV Nhóm I) và tiên tiến tài nguyên dẫn dắt (ICRV Nhóm II). Ba bản thảo thực nghiệm đồng hành — P3 Việt Nam (JABS, under review), P4 Singapore (MIR, under review), P5 Trung Quốc (IJOEM, under review) — cung cấp bằng chứng đất nước-cụ thể kiểm định H1–H6 và cấu trúc khả nghiệm CĐ2.</w:t>
       </w:r>
     </w:p>
     <w:p>
@@ -475,7 +475,7 @@
         <w:t xml:space="preserve"> </w:t>
       </w:r>
       <w:r>
-        <w:t xml:space="preserve">WBES survey waves (2009–2025). The main contributions are: (i) an integrated 4-tier + Digital lens framework with no equivalent for Asia; (ii) the separation of TCI and DAI within the Context-Contingent Digital Capability Model (CDCM) developed from Chuyên đề 1 evidence; (iii) the M7 three-way moderation model; (iv) sub-grouping of the Advanced regime into innovation-driven (ICRV Group I) and resource-driven (ICRV Group II) types. Three companion empirical working papers — P3 Vietnam (APJM), P4 Singapore (MIR), P5 China (IJOEM) — provide country-specific evidence testing H1–H6 and validating the CĐ2 model structure.</w:t>
+        <w:t xml:space="preserve">WBES survey waves (2009–2025). The main contributions are: (i) an integrated 4-tier + Digital lens framework with no equivalent for Asia; (ii) the separation of TCI and DAI within the Context-Contingent Digital Capability Model (CDCM) developed from Chuyên đề 1 evidence; (iii) the M7 three-way moderation model; (iv) sub-grouping of the Advanced regime into innovation-driven (ICRV Group I) and resource-driven (ICRV Group II) types. Three companion empirical working papers — P3 Vietnam (JABS), P4 Singapore (MIR), P5 China (IJOEM) — provide country-specific evidence testing H1–H6 and validating the CĐ2 model structure.</w:t>
       </w:r>
     </w:p>
     <w:p>
@@ -2046,7 +2046,7 @@
           <w:bCs/>
           <w:b/>
         </w:rPr>
-        <w:t xml:space="preserve">P3 Việt Nam (APJM, under review)</w:t>
+        <w:t xml:space="preserve">P3 Việt Nam (JABS, under review)</w:t>
       </w:r>
       <w:r>
         <w:t xml:space="preserve"> </w:t>
@@ -6788,7 +6788,7 @@
           <w:iCs/>
           <w:i/>
         </w:rPr>
-        <w:t xml:space="preserve">P3 Việt Nam (Đỗ &amp; Phan, 2026, APJM under review)</w:t>
+        <w:t xml:space="preserve">P3 Việt Nam (Đỗ &amp; Phan, 2026, JABS under review)</w:t>
       </w:r>
       <w:r>
         <w:t xml:space="preserve">: Phân tích 2.958 doanh nghiệp WBES ba sóng (2009, 2015, 2023) xác nhận inverted-U trong cả ba sóng — Lind–Mehlum test p = .006 (2009), .009 (2015), .013 (2023), p &lt; .001 (pooled). Turning points: 46.2% (2009), 39.3% (2015), 41.6% (2023), 39.7% (pooled). P3 phân tách H1 thành</w:t>
@@ -15803,7 +15803,7 @@
         <w:t xml:space="preserve">19_cd2_part3_models_data_conclusion_vi.md</w:t>
       </w:r>
       <w:r>
-        <w:t xml:space="preserve">) — Chương 6–9. Bản thảo P3 (APJM), P4 (MIR), P5 (IJOEM) — tài liệu nguồn cho số liệu empirical trong §3.3 và §5.1–§5.3. CĐ1 (</w:t>
+        <w:t xml:space="preserve">) — Chương 6–9. Bản thảo P3 (JABS), P4 (MIR), P5 (IJOEM) — tài liệu nguồn cho số liệu empirical trong §3.3 và §5.1–§5.3. CĐ1 (</w:t>
       </w:r>
       <w:r>
         <w:rPr>
@@ -28744,7 +28744,7 @@
         <w:t xml:space="preserve"> </w:t>
       </w:r>
       <w:r>
-        <w:t xml:space="preserve">[Manuscript under review]. Asia Pacific Journal of Management. (P3 — Việt Nam)</w:t>
+        <w:t xml:space="preserve">[Manuscript under review]. Journal of Asia Business Studies. (P3 — Việt Nam)</w:t>
       </w:r>
     </w:p>
     <w:p>

</xml_diff>